<commit_message>
Corrected the eval algorithm for each year
</commit_message>
<xml_diff>
--- a/Algorithm_Documentation.docx
+++ b/Algorithm_Documentation.docx
@@ -8,26 +8,9 @@
         <w:jc w:val="both"/>
         <w:rPr>
           <w:rFonts w:ascii="Times New Roman" w:hAnsi="Times New Roman" w:cs="Times New Roman"/>
-          <w:color w:val="auto"/>
-          <w:sz w:val="32"/>
-          <w:szCs w:val="32"/>
-        </w:rPr>
-      </w:pPr>
-      <w:r>
-        <w:rPr>
-          <w:rFonts w:ascii="Times New Roman" w:hAnsi="Times New Roman" w:cs="Times New Roman"/>
-          <w:color w:val="auto"/>
-          <w:sz w:val="32"/>
-          <w:szCs w:val="32"/>
-        </w:rPr>
-        <w:t>1. Overview</w:t>
-      </w:r>
-    </w:p>
-    <w:p>
-      <w:pPr>
-        <w:jc w:val="both"/>
-        <w:rPr>
-          <w:rFonts w:ascii="Times New Roman" w:hAnsi="Times New Roman" w:cs="Times New Roman"/>
+          <w:b w:val="0"/>
+          <w:bCs w:val="0"/>
+          <w:color w:val="000000" w:themeColor="text1"/>
           <w:sz w:val="24"/>
           <w:szCs w:val="24"/>
         </w:rPr>
@@ -35,10 +18,34 @@
       <w:r>
         <w:rPr>
           <w:rFonts w:ascii="Times New Roman" w:hAnsi="Times New Roman" w:cs="Times New Roman"/>
+          <w:b w:val="0"/>
+          <w:bCs w:val="0"/>
+          <w:color w:val="000000" w:themeColor="text1"/>
           <w:sz w:val="24"/>
           <w:szCs w:val="24"/>
         </w:rPr>
-        <w:t>The new scoring algorithm calculates a "Deal Quality" score for every car, ranging from 0.0 to 100.0. Rather than scoring price and mileage independently, it uses a dynamic market model to calculate an Expected Price based on how mileage affects depreciation for that specific car model. Every car starts with a Base Score of 50.0 points. The score is then adjusted based on how far the actual listed price deviates from our calculated Expected Price.</w:t>
+        <w:t>1. Overview</w:t>
+      </w:r>
+    </w:p>
+    <w:p>
+      <w:pPr>
+        <w:ind w:firstLine="720"/>
+        <w:jc w:val="both"/>
+        <w:rPr>
+          <w:rFonts w:ascii="Times New Roman" w:hAnsi="Times New Roman" w:cs="Times New Roman"/>
+          <w:color w:val="000000" w:themeColor="text1"/>
+          <w:sz w:val="24"/>
+          <w:szCs w:val="24"/>
+        </w:rPr>
+      </w:pPr>
+      <w:r>
+        <w:rPr>
+          <w:rFonts w:ascii="Times New Roman" w:hAnsi="Times New Roman" w:cs="Times New Roman"/>
+          <w:color w:val="000000" w:themeColor="text1"/>
+          <w:sz w:val="24"/>
+          <w:szCs w:val="24"/>
+        </w:rPr>
+        <w:t>The scoring algorithm calculates a "Deal Quality" score for every car, ranging from 0.0 to 100.0. It uses a dynamic market model to calculate an Expected Price based on how mileage affects depreciation for highly specific groupings of cars. Every car starts with a Base Score of 50.0 points. The score is then adjusted based on a non-linear piecewise function that evaluates how far the actual listed price deviates from our calculated Expected Price.</w:t>
       </w:r>
     </w:p>
     <w:p>
@@ -47,26 +54,9 @@
         <w:jc w:val="both"/>
         <w:rPr>
           <w:rFonts w:ascii="Times New Roman" w:hAnsi="Times New Roman" w:cs="Times New Roman"/>
-          <w:color w:val="auto"/>
-          <w:sz w:val="32"/>
-          <w:szCs w:val="32"/>
-        </w:rPr>
-      </w:pPr>
-      <w:r>
-        <w:rPr>
-          <w:rFonts w:ascii="Times New Roman" w:hAnsi="Times New Roman" w:cs="Times New Roman"/>
-          <w:color w:val="auto"/>
-          <w:sz w:val="32"/>
-          <w:szCs w:val="32"/>
-        </w:rPr>
-        <w:t>2. Establishing the Market Baseline</w:t>
-      </w:r>
-    </w:p>
-    <w:p>
-      <w:pPr>
-        <w:jc w:val="both"/>
-        <w:rPr>
-          <w:rFonts w:ascii="Times New Roman" w:hAnsi="Times New Roman" w:cs="Times New Roman"/>
+          <w:b w:val="0"/>
+          <w:bCs w:val="0"/>
+          <w:color w:val="000000" w:themeColor="text1"/>
           <w:sz w:val="24"/>
           <w:szCs w:val="24"/>
         </w:rPr>
@@ -74,10 +64,34 @@
       <w:r>
         <w:rPr>
           <w:rFonts w:ascii="Times New Roman" w:hAnsi="Times New Roman" w:cs="Times New Roman"/>
+          <w:b w:val="0"/>
+          <w:bCs w:val="0"/>
+          <w:color w:val="000000" w:themeColor="text1"/>
           <w:sz w:val="24"/>
           <w:szCs w:val="24"/>
         </w:rPr>
-        <w:t>To understand what a car should cost, the algorithm looks at identical cars on the market (same Brand, Model, and Generation) and establishes a baseline:</w:t>
+        <w:t>2. Establishing the Market Baseline</w:t>
+      </w:r>
+    </w:p>
+    <w:p>
+      <w:pPr>
+        <w:ind w:firstLine="360"/>
+        <w:jc w:val="both"/>
+        <w:rPr>
+          <w:rFonts w:ascii="Times New Roman" w:hAnsi="Times New Roman" w:cs="Times New Roman"/>
+          <w:color w:val="000000" w:themeColor="text1"/>
+          <w:sz w:val="24"/>
+          <w:szCs w:val="24"/>
+        </w:rPr>
+      </w:pPr>
+      <w:r>
+        <w:rPr>
+          <w:rFonts w:ascii="Times New Roman" w:hAnsi="Times New Roman" w:cs="Times New Roman"/>
+          <w:color w:val="000000" w:themeColor="text1"/>
+          <w:sz w:val="24"/>
+          <w:szCs w:val="24"/>
+        </w:rPr>
+        <w:t>To understand what a car should cost, the algorithm looks at identical cars on the market by strictly grouping them by: Brand, Model, Generation, Engine Size, Fuel Type, and Gearbox.</w:t>
       </w:r>
     </w:p>
     <w:p>
@@ -86,6 +100,7 @@
         <w:jc w:val="both"/>
         <w:rPr>
           <w:rFonts w:ascii="Times New Roman" w:hAnsi="Times New Roman" w:cs="Times New Roman"/>
+          <w:color w:val="000000" w:themeColor="text1"/>
           <w:sz w:val="24"/>
           <w:szCs w:val="24"/>
         </w:rPr>
@@ -93,19 +108,11 @@
       <w:r>
         <w:rPr>
           <w:rFonts w:ascii="Times New Roman" w:hAnsi="Times New Roman" w:cs="Times New Roman"/>
-          <w:b/>
+          <w:color w:val="000000" w:themeColor="text1"/>
           <w:sz w:val="24"/>
           <w:szCs w:val="24"/>
         </w:rPr>
-        <w:t>Median Price:</w:t>
-      </w:r>
-      <w:r>
-        <w:rPr>
-          <w:rFonts w:ascii="Times New Roman" w:hAnsi="Times New Roman" w:cs="Times New Roman"/>
-          <w:sz w:val="24"/>
-          <w:szCs w:val="24"/>
-        </w:rPr>
-        <w:t xml:space="preserve"> It finds the median market price for the car.</w:t>
+        <w:t>Median Price: Finds the median market price for this exact configuration.</w:t>
       </w:r>
     </w:p>
     <w:p>
@@ -114,6 +121,7 @@
         <w:jc w:val="both"/>
         <w:rPr>
           <w:rFonts w:ascii="Times New Roman" w:hAnsi="Times New Roman" w:cs="Times New Roman"/>
+          <w:color w:val="000000" w:themeColor="text1"/>
           <w:sz w:val="24"/>
           <w:szCs w:val="24"/>
         </w:rPr>
@@ -121,19 +129,11 @@
       <w:r>
         <w:rPr>
           <w:rFonts w:ascii="Times New Roman" w:hAnsi="Times New Roman" w:cs="Times New Roman"/>
-          <w:b/>
+          <w:color w:val="000000" w:themeColor="text1"/>
           <w:sz w:val="24"/>
           <w:szCs w:val="24"/>
         </w:rPr>
-        <w:t>Middle Market Filter:</w:t>
-      </w:r>
-      <w:r>
-        <w:rPr>
-          <w:rFonts w:ascii="Times New Roman" w:hAnsi="Times New Roman" w:cs="Times New Roman"/>
-          <w:sz w:val="24"/>
-          <w:szCs w:val="24"/>
-        </w:rPr>
-        <w:t xml:space="preserve"> It grabs only the cars priced within ± 500 Euros of that median (stripping away outliers, scams, and heavily modified cars).</w:t>
+        <w:t>Middle Market Filter: Grabs only the cars priced within +- 500 Euros of that median (stripping away outliers and scams).</w:t>
       </w:r>
     </w:p>
     <w:p>
@@ -142,6 +142,7 @@
         <w:jc w:val="both"/>
         <w:rPr>
           <w:rFonts w:ascii="Times New Roman" w:hAnsi="Times New Roman" w:cs="Times New Roman"/>
+          <w:color w:val="000000" w:themeColor="text1"/>
           <w:sz w:val="24"/>
           <w:szCs w:val="24"/>
         </w:rPr>
@@ -149,19 +150,11 @@
       <w:r>
         <w:rPr>
           <w:rFonts w:ascii="Times New Roman" w:hAnsi="Times New Roman" w:cs="Times New Roman"/>
-          <w:b/>
+          <w:color w:val="000000" w:themeColor="text1"/>
           <w:sz w:val="24"/>
           <w:szCs w:val="24"/>
         </w:rPr>
-        <w:t>Baseline Mileage:</w:t>
-      </w:r>
-      <w:r>
-        <w:rPr>
-          <w:rFonts w:ascii="Times New Roman" w:hAnsi="Times New Roman" w:cs="Times New Roman"/>
-          <w:sz w:val="24"/>
-          <w:szCs w:val="24"/>
-        </w:rPr>
-        <w:t xml:space="preserve"> It calculates the average mileage of ONLY those middle-market cars. This is the exact mileage we expect a normal car of this type to have.</w:t>
+        <w:t>Baseline Mileage: Calculates the average mileage of ONLY those middle-market cars. This is the exact average mileage we expect.</w:t>
       </w:r>
     </w:p>
     <w:p>
@@ -170,26 +163,9 @@
         <w:jc w:val="both"/>
         <w:rPr>
           <w:rFonts w:ascii="Times New Roman" w:hAnsi="Times New Roman" w:cs="Times New Roman"/>
-          <w:color w:val="auto"/>
-          <w:sz w:val="32"/>
-          <w:szCs w:val="32"/>
-        </w:rPr>
-      </w:pPr>
-      <w:r>
-        <w:rPr>
-          <w:rFonts w:ascii="Times New Roman" w:hAnsi="Times New Roman" w:cs="Times New Roman"/>
-          <w:color w:val="auto"/>
-          <w:sz w:val="32"/>
-          <w:szCs w:val="32"/>
-        </w:rPr>
-        <w:t>3. Dynamic Depreciation Calculation (Per 10,000 km)</w:t>
-      </w:r>
-    </w:p>
-    <w:p>
-      <w:pPr>
-        <w:jc w:val="both"/>
-        <w:rPr>
-          <w:rFonts w:ascii="Times New Roman" w:hAnsi="Times New Roman" w:cs="Times New Roman"/>
+          <w:b w:val="0"/>
+          <w:bCs w:val="0"/>
+          <w:color w:val="000000" w:themeColor="text1"/>
           <w:sz w:val="24"/>
           <w:szCs w:val="24"/>
         </w:rPr>
@@ -197,10 +173,34 @@
       <w:r>
         <w:rPr>
           <w:rFonts w:ascii="Times New Roman" w:hAnsi="Times New Roman" w:cs="Times New Roman"/>
+          <w:b w:val="0"/>
+          <w:bCs w:val="0"/>
+          <w:color w:val="000000" w:themeColor="text1"/>
           <w:sz w:val="24"/>
           <w:szCs w:val="24"/>
         </w:rPr>
-        <w:t>Not all cars lose value at the same rate. An extra 10,000 km on an old economy car might barely affect its price, while 10,000 km on a luxury sports car might drop its value by thousands. To find the true depreciation rate, the algorithm divides the market into two halves:</w:t>
+        <w:t>3. Dynamic Depreciation Calculation (Per 10,000 km)</w:t>
+      </w:r>
+    </w:p>
+    <w:p>
+      <w:pPr>
+        <w:ind w:firstLine="360"/>
+        <w:jc w:val="both"/>
+        <w:rPr>
+          <w:rFonts w:ascii="Times New Roman" w:hAnsi="Times New Roman" w:cs="Times New Roman"/>
+          <w:color w:val="000000" w:themeColor="text1"/>
+          <w:sz w:val="24"/>
+          <w:szCs w:val="24"/>
+        </w:rPr>
+      </w:pPr>
+      <w:r>
+        <w:rPr>
+          <w:rFonts w:ascii="Times New Roman" w:hAnsi="Times New Roman" w:cs="Times New Roman"/>
+          <w:color w:val="000000" w:themeColor="text1"/>
+          <w:sz w:val="24"/>
+          <w:szCs w:val="24"/>
+        </w:rPr>
+        <w:t>Not all cars lose value at the same rate. To find the true depreciation rate, the algorithm divides the market into two halves:</w:t>
       </w:r>
     </w:p>
     <w:p>
@@ -209,6 +209,7 @@
         <w:jc w:val="both"/>
         <w:rPr>
           <w:rFonts w:ascii="Times New Roman" w:hAnsi="Times New Roman" w:cs="Times New Roman"/>
+          <w:color w:val="000000" w:themeColor="text1"/>
           <w:sz w:val="24"/>
           <w:szCs w:val="24"/>
         </w:rPr>
@@ -216,19 +217,11 @@
       <w:r>
         <w:rPr>
           <w:rFonts w:ascii="Times New Roman" w:hAnsi="Times New Roman" w:cs="Times New Roman"/>
-          <w:b/>
+          <w:color w:val="000000" w:themeColor="text1"/>
           <w:sz w:val="24"/>
           <w:szCs w:val="24"/>
         </w:rPr>
-        <w:t>Low-Mileage Half:</w:t>
-      </w:r>
-      <w:r>
-        <w:rPr>
-          <w:rFonts w:ascii="Times New Roman" w:hAnsi="Times New Roman" w:cs="Times New Roman"/>
-          <w:sz w:val="24"/>
-          <w:szCs w:val="24"/>
-        </w:rPr>
-        <w:t xml:space="preserve"> Cars with mileage below the median.</w:t>
+        <w:t>Low-Mileage Half: Cars with mileage below the median.</w:t>
       </w:r>
     </w:p>
     <w:p>
@@ -237,6 +230,7 @@
         <w:jc w:val="both"/>
         <w:rPr>
           <w:rFonts w:ascii="Times New Roman" w:hAnsi="Times New Roman" w:cs="Times New Roman"/>
+          <w:color w:val="000000" w:themeColor="text1"/>
           <w:sz w:val="24"/>
           <w:szCs w:val="24"/>
         </w:rPr>
@@ -244,26 +238,20 @@
       <w:r>
         <w:rPr>
           <w:rFonts w:ascii="Times New Roman" w:hAnsi="Times New Roman" w:cs="Times New Roman"/>
-          <w:b/>
+          <w:color w:val="000000" w:themeColor="text1"/>
           <w:sz w:val="24"/>
           <w:szCs w:val="24"/>
         </w:rPr>
-        <w:t>High-Mileage Half:</w:t>
-      </w:r>
-      <w:r>
-        <w:rPr>
-          <w:rFonts w:ascii="Times New Roman" w:hAnsi="Times New Roman" w:cs="Times New Roman"/>
-          <w:sz w:val="24"/>
-          <w:szCs w:val="24"/>
-        </w:rPr>
-        <w:t xml:space="preserve"> Cars with mileage above the median.</w:t>
+        <w:t>High-Mileage Half: Cars with mileage above the median.</w:t>
       </w:r>
     </w:p>
     <w:p>
       <w:pPr>
+        <w:ind w:firstLine="360"/>
         <w:jc w:val="both"/>
         <w:rPr>
           <w:rFonts w:ascii="Times New Roman" w:hAnsi="Times New Roman" w:cs="Times New Roman"/>
+          <w:color w:val="000000" w:themeColor="text1"/>
           <w:sz w:val="24"/>
           <w:szCs w:val="24"/>
         </w:rPr>
@@ -271,10 +259,11 @@
       <w:r>
         <w:rPr>
           <w:rFonts w:ascii="Times New Roman" w:hAnsi="Times New Roman" w:cs="Times New Roman"/>
+          <w:color w:val="000000" w:themeColor="text1"/>
           <w:sz w:val="24"/>
           <w:szCs w:val="24"/>
         </w:rPr>
-        <w:t>By comparing the average price difference between these two halves against their average mileage difference, the algorithm mathematically extracts exactly how much money the car loses for every 10,000 km driven (Depreciation per 10k km). (If there isn't enough data, it falls back to a standard 5% depreciation per 10k km).</w:t>
+        <w:t>By comparing the average price difference against the average mileage difference, the algorithm mathematically extracts exactly how much money the car loses for every 10,000 km driven. (Falls back to 5% if insufficient data).</w:t>
       </w:r>
     </w:p>
     <w:p>
@@ -283,26 +272,9 @@
         <w:jc w:val="both"/>
         <w:rPr>
           <w:rFonts w:ascii="Times New Roman" w:hAnsi="Times New Roman" w:cs="Times New Roman"/>
-          <w:color w:val="auto"/>
-          <w:sz w:val="32"/>
-          <w:szCs w:val="32"/>
-        </w:rPr>
-      </w:pPr>
-      <w:r>
-        <w:rPr>
-          <w:rFonts w:ascii="Times New Roman" w:hAnsi="Times New Roman" w:cs="Times New Roman"/>
-          <w:color w:val="auto"/>
-          <w:sz w:val="32"/>
-          <w:szCs w:val="32"/>
-        </w:rPr>
-        <w:t>4. Calculating the Expected Price</w:t>
-      </w:r>
-    </w:p>
-    <w:p>
-      <w:pPr>
-        <w:jc w:val="both"/>
-        <w:rPr>
-          <w:rFonts w:ascii="Times New Roman" w:hAnsi="Times New Roman" w:cs="Times New Roman"/>
+          <w:b w:val="0"/>
+          <w:bCs w:val="0"/>
+          <w:color w:val="000000" w:themeColor="text1"/>
           <w:sz w:val="24"/>
           <w:szCs w:val="24"/>
         </w:rPr>
@@ -310,19 +282,22 @@
       <w:r>
         <w:rPr>
           <w:rFonts w:ascii="Times New Roman" w:hAnsi="Times New Roman" w:cs="Times New Roman"/>
+          <w:b w:val="0"/>
+          <w:bCs w:val="0"/>
+          <w:color w:val="000000" w:themeColor="text1"/>
           <w:sz w:val="24"/>
           <w:szCs w:val="24"/>
         </w:rPr>
-        <w:t>With the baseline and depreciation rate calculated, the algorithm predicts what the car should cost. If the car's actual mileage is higher than the baseline, the Expected Price is lowered. If the car's actual mileage is lower than the baseline, the Expected Price is raised.</w:t>
+        <w:t>4. Calculating the Expected Price</w:t>
       </w:r>
     </w:p>
     <w:p>
       <w:pPr>
-        <w:pStyle w:val="IntenseQuote"/>
+        <w:ind w:firstLine="720"/>
         <w:jc w:val="both"/>
         <w:rPr>
           <w:rFonts w:ascii="Times New Roman" w:hAnsi="Times New Roman" w:cs="Times New Roman"/>
-          <w:color w:val="auto"/>
+          <w:color w:val="000000" w:themeColor="text1"/>
           <w:sz w:val="24"/>
           <w:szCs w:val="24"/>
         </w:rPr>
@@ -330,12 +305,63 @@
       <w:r>
         <w:rPr>
           <w:rFonts w:ascii="Times New Roman" w:hAnsi="Times New Roman" w:cs="Times New Roman"/>
-          <w:color w:val="auto"/>
+          <w:color w:val="000000" w:themeColor="text1"/>
           <w:sz w:val="24"/>
           <w:szCs w:val="24"/>
         </w:rPr>
-        <w:lastRenderedPageBreak/>
-        <w:t>Expected Price = Median Price - ( (Actual Mileage - Baseline Mileage) / 10,000 ) * Depreciation per 10k</w:t>
+        <w:t>If the car's actual mileage is higher than the baseline, the Expected Price is lowered. If lower, it is raised. Spam mileages (e.g., 11111) and suspiciously low mileages (&lt;6,000 km/year) are ignored during this math so they don't inflate the expected price.</w:t>
+      </w:r>
+    </w:p>
+    <w:p>
+      <w:pPr>
+        <w:pStyle w:val="IntenseQuote"/>
+        <w:pBdr>
+          <w:bottom w:val="single" w:sz="4" w:space="31" w:color="4F81BD" w:themeColor="accent1"/>
+        </w:pBdr>
+        <w:jc w:val="both"/>
+        <w:rPr>
+          <w:rFonts w:ascii="Times New Roman" w:hAnsi="Times New Roman" w:cs="Times New Roman"/>
+          <w:b w:val="0"/>
+          <w:bCs w:val="0"/>
+          <w:color w:val="000000" w:themeColor="text1"/>
+          <w:sz w:val="24"/>
+          <w:szCs w:val="24"/>
+        </w:rPr>
+      </w:pPr>
+      <w:r>
+        <w:rPr>
+          <w:rFonts w:ascii="Times New Roman" w:hAnsi="Times New Roman" w:cs="Times New Roman"/>
+          <w:b w:val="0"/>
+          <w:bCs w:val="0"/>
+          <w:color w:val="000000" w:themeColor="text1"/>
+          <w:sz w:val="24"/>
+          <w:szCs w:val="24"/>
+        </w:rPr>
+        <w:t xml:space="preserve">Expected Price = Median Price - </w:t>
+      </w:r>
+      <w:proofErr w:type="gramStart"/>
+      <w:r>
+        <w:rPr>
+          <w:rFonts w:ascii="Times New Roman" w:hAnsi="Times New Roman" w:cs="Times New Roman"/>
+          <w:b w:val="0"/>
+          <w:bCs w:val="0"/>
+          <w:color w:val="000000" w:themeColor="text1"/>
+          <w:sz w:val="24"/>
+          <w:szCs w:val="24"/>
+        </w:rPr>
+        <w:t>( (</w:t>
+      </w:r>
+      <w:proofErr w:type="gramEnd"/>
+      <w:r>
+        <w:rPr>
+          <w:rFonts w:ascii="Times New Roman" w:hAnsi="Times New Roman" w:cs="Times New Roman"/>
+          <w:b w:val="0"/>
+          <w:bCs w:val="0"/>
+          <w:color w:val="000000" w:themeColor="text1"/>
+          <w:sz w:val="24"/>
+          <w:szCs w:val="24"/>
+        </w:rPr>
+        <w:t>Effective Mileage - Baseline Mileage) / 10,000 ) * Depreciation per 10k</w:t>
       </w:r>
     </w:p>
     <w:p>
@@ -344,19 +370,70 @@
         <w:jc w:val="both"/>
         <w:rPr>
           <w:rFonts w:ascii="Times New Roman" w:hAnsi="Times New Roman" w:cs="Times New Roman"/>
-          <w:color w:val="auto"/>
-          <w:sz w:val="32"/>
-          <w:szCs w:val="32"/>
+          <w:b w:val="0"/>
+          <w:bCs w:val="0"/>
+          <w:color w:val="000000" w:themeColor="text1"/>
+          <w:sz w:val="24"/>
+          <w:szCs w:val="24"/>
         </w:rPr>
       </w:pPr>
       <w:r>
         <w:rPr>
           <w:rFonts w:ascii="Times New Roman" w:hAnsi="Times New Roman" w:cs="Times New Roman"/>
-          <w:color w:val="auto"/>
-          <w:sz w:val="32"/>
-          <w:szCs w:val="32"/>
+          <w:b w:val="0"/>
+          <w:bCs w:val="0"/>
+          <w:color w:val="000000" w:themeColor="text1"/>
+          <w:sz w:val="24"/>
+          <w:szCs w:val="24"/>
         </w:rPr>
-        <w:t>5. Scoring the Deal (Deviations)</w:t>
+        <w:lastRenderedPageBreak/>
+        <w:t>5. Non-Linear Scoring Math</w:t>
+      </w:r>
+    </w:p>
+    <w:p>
+      <w:pPr>
+        <w:ind w:firstLine="720"/>
+        <w:jc w:val="both"/>
+        <w:rPr>
+          <w:rFonts w:ascii="Times New Roman" w:hAnsi="Times New Roman" w:cs="Times New Roman"/>
+          <w:color w:val="000000" w:themeColor="text1"/>
+          <w:sz w:val="24"/>
+          <w:szCs w:val="24"/>
+        </w:rPr>
+      </w:pPr>
+      <w:r>
+        <w:rPr>
+          <w:rFonts w:ascii="Times New Roman" w:hAnsi="Times New Roman" w:cs="Times New Roman"/>
+          <w:color w:val="000000" w:themeColor="text1"/>
+          <w:sz w:val="24"/>
+          <w:szCs w:val="24"/>
+        </w:rPr>
+        <w:t>A basic linear scale is unrealistic (a car 60% below market value is likely a scam, not a 100/100 deal). The algorithm uses a non-linear piecewise function to award points.</w:t>
+      </w:r>
+    </w:p>
+    <w:p>
+      <w:pPr>
+        <w:pStyle w:val="Heading2"/>
+        <w:jc w:val="both"/>
+        <w:rPr>
+          <w:rFonts w:ascii="Times New Roman" w:hAnsi="Times New Roman" w:cs="Times New Roman"/>
+          <w:b w:val="0"/>
+          <w:bCs w:val="0"/>
+          <w:color w:val="000000" w:themeColor="text1"/>
+          <w:sz w:val="24"/>
+          <w:szCs w:val="24"/>
+        </w:rPr>
+      </w:pPr>
+      <w:r>
+        <w:rPr>
+          <w:rFonts w:ascii="Times New Roman" w:hAnsi="Times New Roman" w:cs="Times New Roman"/>
+          <w:b w:val="0"/>
+          <w:bCs w:val="0"/>
+          <w:color w:val="000000" w:themeColor="text1"/>
+          <w:sz w:val="24"/>
+          <w:szCs w:val="24"/>
+        </w:rPr>
+        <w:t>Good Deals (Price is LOWER than Expected)</w:t>
       </w:r>
     </w:p>
     <w:p>
@@ -364,6 +441,7 @@
         <w:jc w:val="both"/>
         <w:rPr>
           <w:rFonts w:ascii="Times New Roman" w:hAnsi="Times New Roman" w:cs="Times New Roman"/>
+          <w:color w:val="000000" w:themeColor="text1"/>
           <w:sz w:val="24"/>
           <w:szCs w:val="24"/>
         </w:rPr>
@@ -371,10 +449,11 @@
       <w:r>
         <w:rPr>
           <w:rFonts w:ascii="Times New Roman" w:hAnsi="Times New Roman" w:cs="Times New Roman"/>
+          <w:color w:val="000000" w:themeColor="text1"/>
           <w:sz w:val="24"/>
           <w:szCs w:val="24"/>
         </w:rPr>
-        <w:t>Now that we know the Expected Price, we compare it to the Actual Listed Price to determine if it is a good deal or a rip-off. The difference is converted to a percentage:</w:t>
+        <w:t>Uses diminishing returns to throttle the score of suspiciously cheap cars:</w:t>
       </w:r>
     </w:p>
     <w:tbl>
@@ -384,20 +463,20 @@
         <w:tblLook w:val="04A0" w:firstRow="1" w:lastRow="0" w:firstColumn="1" w:lastColumn="0" w:noHBand="0" w:noVBand="1"/>
       </w:tblPr>
       <w:tblGrid>
-        <w:gridCol w:w="2880"/>
-        <w:gridCol w:w="2880"/>
-        <w:gridCol w:w="2880"/>
+        <w:gridCol w:w="4320"/>
+        <w:gridCol w:w="4320"/>
       </w:tblGrid>
       <w:tr>
         <w:tc>
           <w:tcPr>
-            <w:tcW w:w="2880" w:type="dxa"/>
+            <w:tcW w:w="4320" w:type="dxa"/>
           </w:tcPr>
           <w:p>
             <w:pPr>
               <w:jc w:val="both"/>
               <w:rPr>
                 <w:rFonts w:ascii="Times New Roman" w:hAnsi="Times New Roman" w:cs="Times New Roman"/>
+                <w:color w:val="000000" w:themeColor="text1"/>
                 <w:sz w:val="24"/>
                 <w:szCs w:val="24"/>
               </w:rPr>
@@ -405,22 +484,24 @@
             <w:r>
               <w:rPr>
                 <w:rFonts w:ascii="Times New Roman" w:hAnsi="Times New Roman" w:cs="Times New Roman"/>
+                <w:color w:val="000000" w:themeColor="text1"/>
                 <w:sz w:val="24"/>
                 <w:szCs w:val="24"/>
               </w:rPr>
-              <w:t>Condition</w:t>
+              <w:t>Price Difference %</w:t>
             </w:r>
           </w:p>
         </w:tc>
         <w:tc>
           <w:tcPr>
-            <w:tcW w:w="2880" w:type="dxa"/>
+            <w:tcW w:w="4320" w:type="dxa"/>
           </w:tcPr>
           <w:p>
             <w:pPr>
               <w:jc w:val="both"/>
               <w:rPr>
                 <w:rFonts w:ascii="Times New Roman" w:hAnsi="Times New Roman" w:cs="Times New Roman"/>
+                <w:color w:val="000000" w:themeColor="text1"/>
                 <w:sz w:val="24"/>
                 <w:szCs w:val="24"/>
               </w:rPr>
@@ -428,22 +509,26 @@
             <w:r>
               <w:rPr>
                 <w:rFonts w:ascii="Times New Roman" w:hAnsi="Times New Roman" w:cs="Times New Roman"/>
+                <w:color w:val="000000" w:themeColor="text1"/>
                 <w:sz w:val="24"/>
                 <w:szCs w:val="24"/>
               </w:rPr>
-              <w:t>Effect on Score</w:t>
+              <w:t>Bonus Awarded</w:t>
             </w:r>
           </w:p>
         </w:tc>
+      </w:tr>
+      <w:tr>
         <w:tc>
           <w:tcPr>
-            <w:tcW w:w="2880" w:type="dxa"/>
+            <w:tcW w:w="4320" w:type="dxa"/>
           </w:tcPr>
           <w:p>
             <w:pPr>
               <w:jc w:val="both"/>
               <w:rPr>
                 <w:rFonts w:ascii="Times New Roman" w:hAnsi="Times New Roman" w:cs="Times New Roman"/>
+                <w:color w:val="000000" w:themeColor="text1"/>
                 <w:sz w:val="24"/>
                 <w:szCs w:val="24"/>
               </w:rPr>
@@ -451,10 +536,36 @@
             <w:r>
               <w:rPr>
                 <w:rFonts w:ascii="Times New Roman" w:hAnsi="Times New Roman" w:cs="Times New Roman"/>
+                <w:color w:val="000000" w:themeColor="text1"/>
                 <w:sz w:val="24"/>
                 <w:szCs w:val="24"/>
               </w:rPr>
-              <w:t>Maximum Limit</w:t>
+              <w:t>0% to 20% cheaper</w:t>
+            </w:r>
+          </w:p>
+        </w:tc>
+        <w:tc>
+          <w:tcPr>
+            <w:tcW w:w="4320" w:type="dxa"/>
+          </w:tcPr>
+          <w:p>
+            <w:pPr>
+              <w:jc w:val="both"/>
+              <w:rPr>
+                <w:rFonts w:ascii="Times New Roman" w:hAnsi="Times New Roman" w:cs="Times New Roman"/>
+                <w:color w:val="000000" w:themeColor="text1"/>
+                <w:sz w:val="24"/>
+                <w:szCs w:val="24"/>
+              </w:rPr>
+            </w:pPr>
+            <w:r>
+              <w:rPr>
+                <w:rFonts w:ascii="Times New Roman" w:hAnsi="Times New Roman" w:cs="Times New Roman"/>
+                <w:color w:val="000000" w:themeColor="text1"/>
+                <w:sz w:val="24"/>
+                <w:szCs w:val="24"/>
+              </w:rPr>
+              <w:t>+1.3 points per %</w:t>
             </w:r>
           </w:p>
         </w:tc>
@@ -462,13 +573,14 @@
       <w:tr>
         <w:tc>
           <w:tcPr>
-            <w:tcW w:w="2880" w:type="dxa"/>
+            <w:tcW w:w="4320" w:type="dxa"/>
           </w:tcPr>
           <w:p>
             <w:pPr>
               <w:jc w:val="both"/>
               <w:rPr>
                 <w:rFonts w:ascii="Times New Roman" w:hAnsi="Times New Roman" w:cs="Times New Roman"/>
+                <w:color w:val="000000" w:themeColor="text1"/>
                 <w:sz w:val="24"/>
                 <w:szCs w:val="24"/>
               </w:rPr>
@@ -476,32 +588,24 @@
             <w:r>
               <w:rPr>
                 <w:rFonts w:ascii="Times New Roman" w:hAnsi="Times New Roman" w:cs="Times New Roman"/>
+                <w:color w:val="000000" w:themeColor="text1"/>
                 <w:sz w:val="24"/>
                 <w:szCs w:val="24"/>
               </w:rPr>
-              <w:t xml:space="preserve">Cheaper than </w:t>
+              <w:t>20% to 30% cheaper</w:t>
             </w:r>
-            <w:proofErr w:type="gramStart"/>
-            <w:r>
-              <w:rPr>
-                <w:rFonts w:ascii="Times New Roman" w:hAnsi="Times New Roman" w:cs="Times New Roman"/>
-                <w:sz w:val="24"/>
-                <w:szCs w:val="24"/>
-              </w:rPr>
-              <w:t>Expected</w:t>
-            </w:r>
-            <w:proofErr w:type="gramEnd"/>
           </w:p>
         </w:tc>
         <w:tc>
           <w:tcPr>
-            <w:tcW w:w="2880" w:type="dxa"/>
+            <w:tcW w:w="4320" w:type="dxa"/>
           </w:tcPr>
           <w:p>
             <w:pPr>
               <w:jc w:val="both"/>
               <w:rPr>
                 <w:rFonts w:ascii="Times New Roman" w:hAnsi="Times New Roman" w:cs="Times New Roman"/>
+                <w:color w:val="000000" w:themeColor="text1"/>
                 <w:sz w:val="24"/>
                 <w:szCs w:val="24"/>
               </w:rPr>
@@ -509,22 +613,26 @@
             <w:r>
               <w:rPr>
                 <w:rFonts w:ascii="Times New Roman" w:hAnsi="Times New Roman" w:cs="Times New Roman"/>
+                <w:color w:val="000000" w:themeColor="text1"/>
                 <w:sz w:val="24"/>
                 <w:szCs w:val="24"/>
               </w:rPr>
-              <w:t>For every 1% the actual price is cheaper than expected, add +1.3 points.</w:t>
+              <w:t>+1.0 points per %</w:t>
             </w:r>
           </w:p>
         </w:tc>
+      </w:tr>
+      <w:tr>
         <w:tc>
           <w:tcPr>
-            <w:tcW w:w="2880" w:type="dxa"/>
+            <w:tcW w:w="4320" w:type="dxa"/>
           </w:tcPr>
           <w:p>
             <w:pPr>
               <w:jc w:val="both"/>
               <w:rPr>
                 <w:rFonts w:ascii="Times New Roman" w:hAnsi="Times New Roman" w:cs="Times New Roman"/>
+                <w:color w:val="000000" w:themeColor="text1"/>
                 <w:sz w:val="24"/>
                 <w:szCs w:val="24"/>
               </w:rPr>
@@ -532,10 +640,36 @@
             <w:r>
               <w:rPr>
                 <w:rFonts w:ascii="Times New Roman" w:hAnsi="Times New Roman" w:cs="Times New Roman"/>
+                <w:color w:val="000000" w:themeColor="text1"/>
                 <w:sz w:val="24"/>
                 <w:szCs w:val="24"/>
               </w:rPr>
-              <w:t>Max +45 points</w:t>
+              <w:t>30% to 40% cheaper</w:t>
+            </w:r>
+          </w:p>
+        </w:tc>
+        <w:tc>
+          <w:tcPr>
+            <w:tcW w:w="4320" w:type="dxa"/>
+          </w:tcPr>
+          <w:p>
+            <w:pPr>
+              <w:jc w:val="both"/>
+              <w:rPr>
+                <w:rFonts w:ascii="Times New Roman" w:hAnsi="Times New Roman" w:cs="Times New Roman"/>
+                <w:color w:val="000000" w:themeColor="text1"/>
+                <w:sz w:val="24"/>
+                <w:szCs w:val="24"/>
+              </w:rPr>
+            </w:pPr>
+            <w:r>
+              <w:rPr>
+                <w:rFonts w:ascii="Times New Roman" w:hAnsi="Times New Roman" w:cs="Times New Roman"/>
+                <w:color w:val="000000" w:themeColor="text1"/>
+                <w:sz w:val="24"/>
+                <w:szCs w:val="24"/>
+              </w:rPr>
+              <w:t>+0.5 points per %</w:t>
             </w:r>
           </w:p>
         </w:tc>
@@ -543,13 +677,14 @@
       <w:tr>
         <w:tc>
           <w:tcPr>
-            <w:tcW w:w="2880" w:type="dxa"/>
+            <w:tcW w:w="4320" w:type="dxa"/>
           </w:tcPr>
           <w:p>
             <w:pPr>
               <w:jc w:val="both"/>
               <w:rPr>
                 <w:rFonts w:ascii="Times New Roman" w:hAnsi="Times New Roman" w:cs="Times New Roman"/>
+                <w:color w:val="000000" w:themeColor="text1"/>
                 <w:sz w:val="24"/>
                 <w:szCs w:val="24"/>
               </w:rPr>
@@ -557,22 +692,24 @@
             <w:r>
               <w:rPr>
                 <w:rFonts w:ascii="Times New Roman" w:hAnsi="Times New Roman" w:cs="Times New Roman"/>
+                <w:color w:val="000000" w:themeColor="text1"/>
                 <w:sz w:val="24"/>
                 <w:szCs w:val="24"/>
               </w:rPr>
-              <w:t>More Expensive than Expected</w:t>
+              <w:t>Over 40% cheaper</w:t>
             </w:r>
           </w:p>
         </w:tc>
         <w:tc>
           <w:tcPr>
-            <w:tcW w:w="2880" w:type="dxa"/>
+            <w:tcW w:w="4320" w:type="dxa"/>
           </w:tcPr>
           <w:p>
             <w:pPr>
               <w:jc w:val="both"/>
               <w:rPr>
                 <w:rFonts w:ascii="Times New Roman" w:hAnsi="Times New Roman" w:cs="Times New Roman"/>
+                <w:color w:val="000000" w:themeColor="text1"/>
                 <w:sz w:val="24"/>
                 <w:szCs w:val="24"/>
               </w:rPr>
@@ -580,22 +717,82 @@
             <w:r>
               <w:rPr>
                 <w:rFonts w:ascii="Times New Roman" w:hAnsi="Times New Roman" w:cs="Times New Roman"/>
+                <w:color w:val="000000" w:themeColor="text1"/>
                 <w:sz w:val="24"/>
                 <w:szCs w:val="24"/>
               </w:rPr>
-              <w:t>For every 1% the actual price is more expensive than expected, subtract -1.3 points.</w:t>
+              <w:t>+0.2 points per %</w:t>
             </w:r>
           </w:p>
         </w:tc>
+      </w:tr>
+    </w:tbl>
+    <w:p>
+      <w:pPr>
+        <w:pStyle w:val="Heading2"/>
+        <w:jc w:val="both"/>
+        <w:rPr>
+          <w:rFonts w:ascii="Times New Roman" w:hAnsi="Times New Roman" w:cs="Times New Roman"/>
+          <w:b w:val="0"/>
+          <w:bCs w:val="0"/>
+          <w:color w:val="000000" w:themeColor="text1"/>
+          <w:sz w:val="24"/>
+          <w:szCs w:val="24"/>
+        </w:rPr>
+      </w:pPr>
+      <w:r>
+        <w:rPr>
+          <w:rFonts w:ascii="Times New Roman" w:hAnsi="Times New Roman" w:cs="Times New Roman"/>
+          <w:b w:val="0"/>
+          <w:bCs w:val="0"/>
+          <w:color w:val="000000" w:themeColor="text1"/>
+          <w:sz w:val="24"/>
+          <w:szCs w:val="24"/>
+        </w:rPr>
+        <w:t>Bad Deals (Price is HIGHER than Expected)</w:t>
+      </w:r>
+    </w:p>
+    <w:p>
+      <w:pPr>
+        <w:jc w:val="both"/>
+        <w:rPr>
+          <w:rFonts w:ascii="Times New Roman" w:hAnsi="Times New Roman" w:cs="Times New Roman"/>
+          <w:color w:val="000000" w:themeColor="text1"/>
+          <w:sz w:val="24"/>
+          <w:szCs w:val="24"/>
+        </w:rPr>
+      </w:pPr>
+      <w:r>
+        <w:rPr>
+          <w:rFonts w:ascii="Times New Roman" w:hAnsi="Times New Roman" w:cs="Times New Roman"/>
+          <w:color w:val="000000" w:themeColor="text1"/>
+          <w:sz w:val="24"/>
+          <w:szCs w:val="24"/>
+        </w:rPr>
+        <w:t>Uses an accelerating penalty to harshly punish greedy sellers:</w:t>
+      </w:r>
+    </w:p>
+    <w:tbl>
+      <w:tblPr>
+        <w:tblStyle w:val="TableGrid"/>
+        <w:tblW w:w="0" w:type="auto"/>
+        <w:tblLook w:val="04A0" w:firstRow="1" w:lastRow="0" w:firstColumn="1" w:lastColumn="0" w:noHBand="0" w:noVBand="1"/>
+      </w:tblPr>
+      <w:tblGrid>
+        <w:gridCol w:w="4320"/>
+        <w:gridCol w:w="4320"/>
+      </w:tblGrid>
+      <w:tr>
         <w:tc>
           <w:tcPr>
-            <w:tcW w:w="2880" w:type="dxa"/>
+            <w:tcW w:w="4320" w:type="dxa"/>
           </w:tcPr>
           <w:p>
             <w:pPr>
               <w:jc w:val="both"/>
               <w:rPr>
                 <w:rFonts w:ascii="Times New Roman" w:hAnsi="Times New Roman" w:cs="Times New Roman"/>
+                <w:color w:val="000000" w:themeColor="text1"/>
                 <w:sz w:val="24"/>
                 <w:szCs w:val="24"/>
               </w:rPr>
@@ -603,10 +800,244 @@
             <w:r>
               <w:rPr>
                 <w:rFonts w:ascii="Times New Roman" w:hAnsi="Times New Roman" w:cs="Times New Roman"/>
+                <w:color w:val="000000" w:themeColor="text1"/>
                 <w:sz w:val="24"/>
                 <w:szCs w:val="24"/>
               </w:rPr>
-              <w:t>Max -45 points</w:t>
+              <w:t>Price Difference %</w:t>
+            </w:r>
+          </w:p>
+        </w:tc>
+        <w:tc>
+          <w:tcPr>
+            <w:tcW w:w="4320" w:type="dxa"/>
+          </w:tcPr>
+          <w:p>
+            <w:pPr>
+              <w:jc w:val="both"/>
+              <w:rPr>
+                <w:rFonts w:ascii="Times New Roman" w:hAnsi="Times New Roman" w:cs="Times New Roman"/>
+                <w:color w:val="000000" w:themeColor="text1"/>
+                <w:sz w:val="24"/>
+                <w:szCs w:val="24"/>
+              </w:rPr>
+            </w:pPr>
+            <w:r>
+              <w:rPr>
+                <w:rFonts w:ascii="Times New Roman" w:hAnsi="Times New Roman" w:cs="Times New Roman"/>
+                <w:color w:val="000000" w:themeColor="text1"/>
+                <w:sz w:val="24"/>
+                <w:szCs w:val="24"/>
+              </w:rPr>
+              <w:t>Penalty Applied</w:t>
+            </w:r>
+          </w:p>
+        </w:tc>
+      </w:tr>
+      <w:tr>
+        <w:tc>
+          <w:tcPr>
+            <w:tcW w:w="4320" w:type="dxa"/>
+          </w:tcPr>
+          <w:p>
+            <w:pPr>
+              <w:jc w:val="both"/>
+              <w:rPr>
+                <w:rFonts w:ascii="Times New Roman" w:hAnsi="Times New Roman" w:cs="Times New Roman"/>
+                <w:color w:val="000000" w:themeColor="text1"/>
+                <w:sz w:val="24"/>
+                <w:szCs w:val="24"/>
+              </w:rPr>
+            </w:pPr>
+            <w:r>
+              <w:rPr>
+                <w:rFonts w:ascii="Times New Roman" w:hAnsi="Times New Roman" w:cs="Times New Roman"/>
+                <w:color w:val="000000" w:themeColor="text1"/>
+                <w:sz w:val="24"/>
+                <w:szCs w:val="24"/>
+              </w:rPr>
+              <w:t>0% to 15% overpriced</w:t>
+            </w:r>
+          </w:p>
+        </w:tc>
+        <w:tc>
+          <w:tcPr>
+            <w:tcW w:w="4320" w:type="dxa"/>
+          </w:tcPr>
+          <w:p>
+            <w:pPr>
+              <w:jc w:val="both"/>
+              <w:rPr>
+                <w:rFonts w:ascii="Times New Roman" w:hAnsi="Times New Roman" w:cs="Times New Roman"/>
+                <w:color w:val="000000" w:themeColor="text1"/>
+                <w:sz w:val="24"/>
+                <w:szCs w:val="24"/>
+              </w:rPr>
+            </w:pPr>
+            <w:r>
+              <w:rPr>
+                <w:rFonts w:ascii="Times New Roman" w:hAnsi="Times New Roman" w:cs="Times New Roman"/>
+                <w:color w:val="000000" w:themeColor="text1"/>
+                <w:sz w:val="24"/>
+                <w:szCs w:val="24"/>
+              </w:rPr>
+              <w:t>-1.0 points per %</w:t>
+            </w:r>
+          </w:p>
+        </w:tc>
+      </w:tr>
+      <w:tr>
+        <w:tc>
+          <w:tcPr>
+            <w:tcW w:w="4320" w:type="dxa"/>
+          </w:tcPr>
+          <w:p>
+            <w:pPr>
+              <w:jc w:val="both"/>
+              <w:rPr>
+                <w:rFonts w:ascii="Times New Roman" w:hAnsi="Times New Roman" w:cs="Times New Roman"/>
+                <w:color w:val="000000" w:themeColor="text1"/>
+                <w:sz w:val="24"/>
+                <w:szCs w:val="24"/>
+              </w:rPr>
+            </w:pPr>
+            <w:r>
+              <w:rPr>
+                <w:rFonts w:ascii="Times New Roman" w:hAnsi="Times New Roman" w:cs="Times New Roman"/>
+                <w:color w:val="000000" w:themeColor="text1"/>
+                <w:sz w:val="24"/>
+                <w:szCs w:val="24"/>
+              </w:rPr>
+              <w:t>15% to 25% overpriced</w:t>
+            </w:r>
+          </w:p>
+        </w:tc>
+        <w:tc>
+          <w:tcPr>
+            <w:tcW w:w="4320" w:type="dxa"/>
+          </w:tcPr>
+          <w:p>
+            <w:pPr>
+              <w:jc w:val="both"/>
+              <w:rPr>
+                <w:rFonts w:ascii="Times New Roman" w:hAnsi="Times New Roman" w:cs="Times New Roman"/>
+                <w:color w:val="000000" w:themeColor="text1"/>
+                <w:sz w:val="24"/>
+                <w:szCs w:val="24"/>
+              </w:rPr>
+            </w:pPr>
+            <w:r>
+              <w:rPr>
+                <w:rFonts w:ascii="Times New Roman" w:hAnsi="Times New Roman" w:cs="Times New Roman"/>
+                <w:color w:val="000000" w:themeColor="text1"/>
+                <w:sz w:val="24"/>
+                <w:szCs w:val="24"/>
+              </w:rPr>
+              <w:t>-1.3 points per %</w:t>
+            </w:r>
+          </w:p>
+        </w:tc>
+      </w:tr>
+      <w:tr>
+        <w:tc>
+          <w:tcPr>
+            <w:tcW w:w="4320" w:type="dxa"/>
+          </w:tcPr>
+          <w:p>
+            <w:pPr>
+              <w:jc w:val="both"/>
+              <w:rPr>
+                <w:rFonts w:ascii="Times New Roman" w:hAnsi="Times New Roman" w:cs="Times New Roman"/>
+                <w:color w:val="000000" w:themeColor="text1"/>
+                <w:sz w:val="24"/>
+                <w:szCs w:val="24"/>
+              </w:rPr>
+            </w:pPr>
+            <w:r>
+              <w:rPr>
+                <w:rFonts w:ascii="Times New Roman" w:hAnsi="Times New Roman" w:cs="Times New Roman"/>
+                <w:color w:val="000000" w:themeColor="text1"/>
+                <w:sz w:val="24"/>
+                <w:szCs w:val="24"/>
+              </w:rPr>
+              <w:t>25% to 35% overpriced</w:t>
+            </w:r>
+          </w:p>
+        </w:tc>
+        <w:tc>
+          <w:tcPr>
+            <w:tcW w:w="4320" w:type="dxa"/>
+          </w:tcPr>
+          <w:p>
+            <w:pPr>
+              <w:jc w:val="both"/>
+              <w:rPr>
+                <w:rFonts w:ascii="Times New Roman" w:hAnsi="Times New Roman" w:cs="Times New Roman"/>
+                <w:color w:val="000000" w:themeColor="text1"/>
+                <w:sz w:val="24"/>
+                <w:szCs w:val="24"/>
+              </w:rPr>
+            </w:pPr>
+            <w:r>
+              <w:rPr>
+                <w:rFonts w:ascii="Times New Roman" w:hAnsi="Times New Roman" w:cs="Times New Roman"/>
+                <w:color w:val="000000" w:themeColor="text1"/>
+                <w:sz w:val="24"/>
+                <w:szCs w:val="24"/>
+              </w:rPr>
+              <w:t>-1.6 points per %</w:t>
+            </w:r>
+          </w:p>
+        </w:tc>
+      </w:tr>
+      <w:tr>
+        <w:tc>
+          <w:tcPr>
+            <w:tcW w:w="4320" w:type="dxa"/>
+          </w:tcPr>
+          <w:p>
+            <w:pPr>
+              <w:jc w:val="both"/>
+              <w:rPr>
+                <w:rFonts w:ascii="Times New Roman" w:hAnsi="Times New Roman" w:cs="Times New Roman"/>
+                <w:color w:val="000000" w:themeColor="text1"/>
+                <w:sz w:val="24"/>
+                <w:szCs w:val="24"/>
+              </w:rPr>
+            </w:pPr>
+            <w:r>
+              <w:rPr>
+                <w:rFonts w:ascii="Times New Roman" w:hAnsi="Times New Roman" w:cs="Times New Roman"/>
+                <w:color w:val="000000" w:themeColor="text1"/>
+                <w:sz w:val="24"/>
+                <w:szCs w:val="24"/>
+              </w:rPr>
+              <w:t>Over 35% overpriced</w:t>
+            </w:r>
+          </w:p>
+        </w:tc>
+        <w:tc>
+          <w:tcPr>
+            <w:tcW w:w="4320" w:type="dxa"/>
+          </w:tcPr>
+          <w:p>
+            <w:pPr>
+              <w:jc w:val="both"/>
+              <w:rPr>
+                <w:rFonts w:ascii="Times New Roman" w:hAnsi="Times New Roman" w:cs="Times New Roman"/>
+                <w:color w:val="000000" w:themeColor="text1"/>
+                <w:sz w:val="24"/>
+                <w:szCs w:val="24"/>
+              </w:rPr>
+            </w:pPr>
+            <w:r>
+              <w:rPr>
+                <w:rFonts w:ascii="Times New Roman" w:hAnsi="Times New Roman" w:cs="Times New Roman"/>
+                <w:color w:val="000000" w:themeColor="text1"/>
+                <w:sz w:val="24"/>
+                <w:szCs w:val="24"/>
+              </w:rPr>
+              <w:t>-2.0 points per %</w:t>
             </w:r>
           </w:p>
         </w:tc>
@@ -618,26 +1049,9 @@
         <w:jc w:val="both"/>
         <w:rPr>
           <w:rFonts w:ascii="Times New Roman" w:hAnsi="Times New Roman" w:cs="Times New Roman"/>
-          <w:color w:val="auto"/>
-          <w:sz w:val="32"/>
-          <w:szCs w:val="32"/>
-        </w:rPr>
-      </w:pPr>
-      <w:r>
-        <w:rPr>
-          <w:rFonts w:ascii="Times New Roman" w:hAnsi="Times New Roman" w:cs="Times New Roman"/>
-          <w:color w:val="auto"/>
-          <w:sz w:val="32"/>
-          <w:szCs w:val="32"/>
-        </w:rPr>
-        <w:t>6. Hard Penalties</w:t>
-      </w:r>
-    </w:p>
-    <w:p>
-      <w:pPr>
-        <w:jc w:val="both"/>
-        <w:rPr>
-          <w:rFonts w:ascii="Times New Roman" w:hAnsi="Times New Roman" w:cs="Times New Roman"/>
+          <w:b w:val="0"/>
+          <w:bCs w:val="0"/>
+          <w:color w:val="000000" w:themeColor="text1"/>
           <w:sz w:val="24"/>
           <w:szCs w:val="24"/>
         </w:rPr>
@@ -645,309 +1059,118 @@
       <w:r>
         <w:rPr>
           <w:rFonts w:ascii="Times New Roman" w:hAnsi="Times New Roman" w:cs="Times New Roman"/>
+          <w:b w:val="0"/>
+          <w:bCs w:val="0"/>
+          <w:color w:val="000000" w:themeColor="text1"/>
           <w:sz w:val="24"/>
           <w:szCs w:val="24"/>
         </w:rPr>
-        <w:t>To prevent fraudulent or highly undesirable cars from exploiting the math, the algorithm applies hard penalties:</w:t>
+        <w:t>6. Hard Penalties</w:t>
       </w:r>
     </w:p>
-    <w:tbl>
-      <w:tblPr>
-        <w:tblStyle w:val="TableGrid"/>
-        <w:tblW w:w="0" w:type="auto"/>
-        <w:tblLook w:val="04A0" w:firstRow="1" w:lastRow="0" w:firstColumn="1" w:lastColumn="0" w:noHBand="0" w:noVBand="1"/>
-      </w:tblPr>
-      <w:tblGrid>
-        <w:gridCol w:w="2880"/>
-        <w:gridCol w:w="2880"/>
-        <w:gridCol w:w="2880"/>
-      </w:tblGrid>
-      <w:tr>
-        <w:tc>
-          <w:tcPr>
-            <w:tcW w:w="2880" w:type="dxa"/>
-          </w:tcPr>
-          <w:p>
-            <w:pPr>
-              <w:jc w:val="both"/>
-              <w:rPr>
-                <w:rFonts w:ascii="Times New Roman" w:hAnsi="Times New Roman" w:cs="Times New Roman"/>
-                <w:sz w:val="24"/>
-                <w:szCs w:val="24"/>
-              </w:rPr>
-            </w:pPr>
-            <w:r>
-              <w:rPr>
-                <w:rFonts w:ascii="Times New Roman" w:hAnsi="Times New Roman" w:cs="Times New Roman"/>
-                <w:sz w:val="24"/>
-                <w:szCs w:val="24"/>
-              </w:rPr>
-              <w:t>Penalty Name</w:t>
-            </w:r>
-          </w:p>
-        </w:tc>
-        <w:tc>
-          <w:tcPr>
-            <w:tcW w:w="2880" w:type="dxa"/>
-          </w:tcPr>
-          <w:p>
-            <w:pPr>
-              <w:jc w:val="both"/>
-              <w:rPr>
-                <w:rFonts w:ascii="Times New Roman" w:hAnsi="Times New Roman" w:cs="Times New Roman"/>
-                <w:sz w:val="24"/>
-                <w:szCs w:val="24"/>
-              </w:rPr>
-            </w:pPr>
-            <w:r>
-              <w:rPr>
-                <w:rFonts w:ascii="Times New Roman" w:hAnsi="Times New Roman" w:cs="Times New Roman"/>
-                <w:sz w:val="24"/>
-                <w:szCs w:val="24"/>
-              </w:rPr>
-              <w:t>Trigger Condition</w:t>
-            </w:r>
-          </w:p>
-        </w:tc>
-        <w:tc>
-          <w:tcPr>
-            <w:tcW w:w="2880" w:type="dxa"/>
-          </w:tcPr>
-          <w:p>
-            <w:pPr>
-              <w:jc w:val="both"/>
-              <w:rPr>
-                <w:rFonts w:ascii="Times New Roman" w:hAnsi="Times New Roman" w:cs="Times New Roman"/>
-                <w:sz w:val="24"/>
-                <w:szCs w:val="24"/>
-              </w:rPr>
-            </w:pPr>
-            <w:r>
-              <w:rPr>
-                <w:rFonts w:ascii="Times New Roman" w:hAnsi="Times New Roman" w:cs="Times New Roman"/>
-                <w:sz w:val="24"/>
-                <w:szCs w:val="24"/>
-              </w:rPr>
-              <w:t>Consequence</w:t>
-            </w:r>
-          </w:p>
-        </w:tc>
-      </w:tr>
-      <w:tr>
-        <w:tc>
-          <w:tcPr>
-            <w:tcW w:w="2880" w:type="dxa"/>
-          </w:tcPr>
-          <w:p>
-            <w:pPr>
-              <w:jc w:val="both"/>
-              <w:rPr>
-                <w:rFonts w:ascii="Times New Roman" w:hAnsi="Times New Roman" w:cs="Times New Roman"/>
-                <w:sz w:val="24"/>
-                <w:szCs w:val="24"/>
-              </w:rPr>
-            </w:pPr>
-            <w:r>
-              <w:rPr>
-                <w:rFonts w:ascii="Times New Roman" w:hAnsi="Times New Roman" w:cs="Times New Roman"/>
-                <w:sz w:val="24"/>
-                <w:szCs w:val="24"/>
-              </w:rPr>
-              <w:t>Suspiciously Low Mileage (Young)</w:t>
-            </w:r>
-          </w:p>
-        </w:tc>
-        <w:tc>
-          <w:tcPr>
-            <w:tcW w:w="2880" w:type="dxa"/>
-          </w:tcPr>
-          <w:p>
-            <w:pPr>
-              <w:jc w:val="both"/>
-              <w:rPr>
-                <w:rFonts w:ascii="Times New Roman" w:hAnsi="Times New Roman" w:cs="Times New Roman"/>
-                <w:sz w:val="24"/>
-                <w:szCs w:val="24"/>
-              </w:rPr>
-            </w:pPr>
-            <w:r>
-              <w:rPr>
-                <w:rFonts w:ascii="Times New Roman" w:hAnsi="Times New Roman" w:cs="Times New Roman"/>
-                <w:sz w:val="24"/>
-                <w:szCs w:val="24"/>
-              </w:rPr>
-              <w:t>Car is 3 years old or newer AND averages less than 6,000 km/year.</w:t>
-            </w:r>
-          </w:p>
-        </w:tc>
-        <w:tc>
-          <w:tcPr>
-            <w:tcW w:w="2880" w:type="dxa"/>
-          </w:tcPr>
-          <w:p>
-            <w:pPr>
-              <w:jc w:val="both"/>
-              <w:rPr>
-                <w:rFonts w:ascii="Times New Roman" w:hAnsi="Times New Roman" w:cs="Times New Roman"/>
-                <w:sz w:val="24"/>
-                <w:szCs w:val="24"/>
-              </w:rPr>
-            </w:pPr>
-            <w:r>
-              <w:rPr>
-                <w:rFonts w:ascii="Times New Roman" w:hAnsi="Times New Roman" w:cs="Times New Roman"/>
-                <w:sz w:val="24"/>
-                <w:szCs w:val="24"/>
-              </w:rPr>
-              <w:t>Takes a -7.0 point penalty (likely parked unmaintained for years).</w:t>
-            </w:r>
-          </w:p>
-        </w:tc>
-      </w:tr>
-      <w:tr>
-        <w:tc>
-          <w:tcPr>
-            <w:tcW w:w="2880" w:type="dxa"/>
-          </w:tcPr>
-          <w:p>
-            <w:pPr>
-              <w:jc w:val="both"/>
-              <w:rPr>
-                <w:rFonts w:ascii="Times New Roman" w:hAnsi="Times New Roman" w:cs="Times New Roman"/>
-                <w:sz w:val="24"/>
-                <w:szCs w:val="24"/>
-              </w:rPr>
-            </w:pPr>
-            <w:r>
-              <w:rPr>
-                <w:rFonts w:ascii="Times New Roman" w:hAnsi="Times New Roman" w:cs="Times New Roman"/>
-                <w:sz w:val="24"/>
-                <w:szCs w:val="24"/>
-              </w:rPr>
-              <w:t>Suspiciously Low Mileage (Old)</w:t>
-            </w:r>
-          </w:p>
-        </w:tc>
-        <w:tc>
-          <w:tcPr>
-            <w:tcW w:w="2880" w:type="dxa"/>
-          </w:tcPr>
-          <w:p>
-            <w:pPr>
-              <w:jc w:val="both"/>
-              <w:rPr>
-                <w:rFonts w:ascii="Times New Roman" w:hAnsi="Times New Roman" w:cs="Times New Roman"/>
-                <w:sz w:val="24"/>
-                <w:szCs w:val="24"/>
-              </w:rPr>
-            </w:pPr>
-            <w:r>
-              <w:rPr>
-                <w:rFonts w:ascii="Times New Roman" w:hAnsi="Times New Roman" w:cs="Times New Roman"/>
-                <w:sz w:val="24"/>
-                <w:szCs w:val="24"/>
-              </w:rPr>
-              <w:t>Car is older than 3 years AND averages less than 6,000 km/year.</w:t>
-            </w:r>
-          </w:p>
-        </w:tc>
-        <w:tc>
-          <w:tcPr>
-            <w:tcW w:w="2880" w:type="dxa"/>
-          </w:tcPr>
-          <w:p>
-            <w:pPr>
-              <w:jc w:val="both"/>
-              <w:rPr>
-                <w:rFonts w:ascii="Times New Roman" w:hAnsi="Times New Roman" w:cs="Times New Roman"/>
-                <w:sz w:val="24"/>
-                <w:szCs w:val="24"/>
-              </w:rPr>
-            </w:pPr>
-            <w:r>
-              <w:rPr>
-                <w:rFonts w:ascii="Times New Roman" w:hAnsi="Times New Roman" w:cs="Times New Roman"/>
-                <w:sz w:val="24"/>
-                <w:szCs w:val="24"/>
-              </w:rPr>
-              <w:t>Takes a -15.0 point penalty (highly indicative of odometer rollback).</w:t>
-            </w:r>
-          </w:p>
-        </w:tc>
-      </w:tr>
-      <w:tr>
-        <w:tc>
-          <w:tcPr>
-            <w:tcW w:w="2880" w:type="dxa"/>
-          </w:tcPr>
-          <w:p>
-            <w:pPr>
-              <w:jc w:val="both"/>
-              <w:rPr>
-                <w:rFonts w:ascii="Times New Roman" w:hAnsi="Times New Roman" w:cs="Times New Roman"/>
-                <w:sz w:val="24"/>
-                <w:szCs w:val="24"/>
-              </w:rPr>
-            </w:pPr>
-            <w:r>
-              <w:rPr>
-                <w:rFonts w:ascii="Times New Roman" w:hAnsi="Times New Roman" w:cs="Times New Roman"/>
-                <w:sz w:val="24"/>
-                <w:szCs w:val="24"/>
-              </w:rPr>
-              <w:t>Damaged / Salvage State</w:t>
-            </w:r>
-          </w:p>
-        </w:tc>
-        <w:tc>
-          <w:tcPr>
-            <w:tcW w:w="2880" w:type="dxa"/>
-          </w:tcPr>
-          <w:p>
-            <w:pPr>
-              <w:jc w:val="both"/>
-              <w:rPr>
-                <w:rFonts w:ascii="Times New Roman" w:hAnsi="Times New Roman" w:cs="Times New Roman"/>
-                <w:sz w:val="24"/>
-                <w:szCs w:val="24"/>
-              </w:rPr>
-            </w:pPr>
-            <w:r>
-              <w:rPr>
-                <w:rFonts w:ascii="Times New Roman" w:hAnsi="Times New Roman" w:cs="Times New Roman"/>
-                <w:sz w:val="24"/>
-                <w:szCs w:val="24"/>
-              </w:rPr>
-              <w:t>The "state" column contains words like damage, salvage, crash, wreck, defect.</w:t>
-            </w:r>
-          </w:p>
-        </w:tc>
-        <w:tc>
-          <w:tcPr>
-            <w:tcW w:w="2880" w:type="dxa"/>
-          </w:tcPr>
-          <w:p>
-            <w:pPr>
-              <w:jc w:val="both"/>
-              <w:rPr>
-                <w:rFonts w:ascii="Times New Roman" w:hAnsi="Times New Roman" w:cs="Times New Roman"/>
-                <w:sz w:val="24"/>
-                <w:szCs w:val="24"/>
-              </w:rPr>
-            </w:pPr>
-            <w:r>
-              <w:rPr>
-                <w:rFonts w:ascii="Times New Roman" w:hAnsi="Times New Roman" w:cs="Times New Roman"/>
-                <w:sz w:val="24"/>
-                <w:szCs w:val="24"/>
-              </w:rPr>
-              <w:t>Score is forcefully capped at 30.0 (maximum).</w:t>
-            </w:r>
-          </w:p>
-        </w:tc>
-      </w:tr>
-    </w:tbl>
-    <w:p/>
+    <w:p>
+      <w:pPr>
+        <w:pStyle w:val="ListBullet"/>
+        <w:jc w:val="both"/>
+        <w:rPr>
+          <w:rFonts w:ascii="Times New Roman" w:hAnsi="Times New Roman" w:cs="Times New Roman"/>
+          <w:color w:val="000000" w:themeColor="text1"/>
+          <w:sz w:val="24"/>
+          <w:szCs w:val="24"/>
+        </w:rPr>
+      </w:pPr>
+      <w:r>
+        <w:rPr>
+          <w:rFonts w:ascii="Times New Roman" w:hAnsi="Times New Roman" w:cs="Times New Roman"/>
+          <w:color w:val="000000" w:themeColor="text1"/>
+          <w:sz w:val="24"/>
+          <w:szCs w:val="24"/>
+        </w:rPr>
+        <w:t xml:space="preserve">Suspicious Mileage (Young): &lt;6,000 km/yr on a car &lt;=3 years old -&gt; </w:t>
+      </w:r>
+      <w:proofErr w:type="gramStart"/>
+      <w:r>
+        <w:rPr>
+          <w:rFonts w:ascii="Times New Roman" w:hAnsi="Times New Roman" w:cs="Times New Roman"/>
+          <w:color w:val="000000" w:themeColor="text1"/>
+          <w:sz w:val="24"/>
+          <w:szCs w:val="24"/>
+        </w:rPr>
+        <w:t>-7.0 point</w:t>
+      </w:r>
+      <w:proofErr w:type="gramEnd"/>
+      <w:r>
+        <w:rPr>
+          <w:rFonts w:ascii="Times New Roman" w:hAnsi="Times New Roman" w:cs="Times New Roman"/>
+          <w:color w:val="000000" w:themeColor="text1"/>
+          <w:sz w:val="24"/>
+          <w:szCs w:val="24"/>
+        </w:rPr>
+        <w:t xml:space="preserve"> penalty.</w:t>
+      </w:r>
+    </w:p>
+    <w:p>
+      <w:pPr>
+        <w:pStyle w:val="ListBullet"/>
+        <w:jc w:val="both"/>
+        <w:rPr>
+          <w:rFonts w:ascii="Times New Roman" w:hAnsi="Times New Roman" w:cs="Times New Roman"/>
+          <w:color w:val="000000" w:themeColor="text1"/>
+          <w:sz w:val="24"/>
+          <w:szCs w:val="24"/>
+        </w:rPr>
+      </w:pPr>
+      <w:r>
+        <w:rPr>
+          <w:rFonts w:ascii="Times New Roman" w:hAnsi="Times New Roman" w:cs="Times New Roman"/>
+          <w:color w:val="000000" w:themeColor="text1"/>
+          <w:sz w:val="24"/>
+          <w:szCs w:val="24"/>
+        </w:rPr>
+        <w:t xml:space="preserve">Suspicious Mileage / Spam (Old): &lt;6,000 km/yr or obvious spam (11111) -&gt; </w:t>
+      </w:r>
+      <w:proofErr w:type="gramStart"/>
+      <w:r>
+        <w:rPr>
+          <w:rFonts w:ascii="Times New Roman" w:hAnsi="Times New Roman" w:cs="Times New Roman"/>
+          <w:color w:val="000000" w:themeColor="text1"/>
+          <w:sz w:val="24"/>
+          <w:szCs w:val="24"/>
+        </w:rPr>
+        <w:t>-15.0 point</w:t>
+      </w:r>
+      <w:proofErr w:type="gramEnd"/>
+      <w:r>
+        <w:rPr>
+          <w:rFonts w:ascii="Times New Roman" w:hAnsi="Times New Roman" w:cs="Times New Roman"/>
+          <w:color w:val="000000" w:themeColor="text1"/>
+          <w:sz w:val="24"/>
+          <w:szCs w:val="24"/>
+        </w:rPr>
+        <w:t xml:space="preserve"> penalty.</w:t>
+      </w:r>
+    </w:p>
+    <w:p>
+      <w:pPr>
+        <w:pStyle w:val="ListBullet"/>
+        <w:jc w:val="both"/>
+        <w:rPr>
+          <w:rFonts w:ascii="Times New Roman" w:hAnsi="Times New Roman" w:cs="Times New Roman"/>
+          <w:color w:val="000000" w:themeColor="text1"/>
+          <w:sz w:val="24"/>
+          <w:szCs w:val="24"/>
+        </w:rPr>
+      </w:pPr>
+      <w:r>
+        <w:rPr>
+          <w:rFonts w:ascii="Times New Roman" w:hAnsi="Times New Roman" w:cs="Times New Roman"/>
+          <w:color w:val="000000" w:themeColor="text1"/>
+          <w:sz w:val="24"/>
+          <w:szCs w:val="24"/>
+        </w:rPr>
+        <w:t>Damaged / Salvage: Score forcefully capped at max 30.0.</w:t>
+      </w:r>
+    </w:p>
     <w:sectPr>
       <w:pgSz w:w="12240" w:h="15840"/>
       <w:pgMar w:top="1440" w:right="1800" w:bottom="1440" w:left="1800" w:header="720" w:footer="720" w:gutter="0"/>
@@ -1131,31 +1354,31 @@
       </w:rPr>
     </w:lvl>
   </w:abstractNum>
-  <w:num w:numId="1" w16cid:durableId="955454173">
+  <w:num w:numId="1" w16cid:durableId="881793588">
     <w:abstractNumId w:val="8"/>
   </w:num>
-  <w:num w:numId="2" w16cid:durableId="1021391295">
+  <w:num w:numId="2" w16cid:durableId="206189172">
     <w:abstractNumId w:val="6"/>
   </w:num>
-  <w:num w:numId="3" w16cid:durableId="462505540">
+  <w:num w:numId="3" w16cid:durableId="175584052">
     <w:abstractNumId w:val="5"/>
   </w:num>
-  <w:num w:numId="4" w16cid:durableId="168759542">
+  <w:num w:numId="4" w16cid:durableId="1151022413">
     <w:abstractNumId w:val="4"/>
   </w:num>
-  <w:num w:numId="5" w16cid:durableId="679770688">
+  <w:num w:numId="5" w16cid:durableId="743334390">
     <w:abstractNumId w:val="7"/>
   </w:num>
-  <w:num w:numId="6" w16cid:durableId="245650536">
+  <w:num w:numId="6" w16cid:durableId="856506625">
     <w:abstractNumId w:val="3"/>
   </w:num>
-  <w:num w:numId="7" w16cid:durableId="1523007847">
+  <w:num w:numId="7" w16cid:durableId="39205295">
     <w:abstractNumId w:val="2"/>
   </w:num>
-  <w:num w:numId="8" w16cid:durableId="1253323139">
+  <w:num w:numId="8" w16cid:durableId="197931370">
     <w:abstractNumId w:val="1"/>
   </w:num>
-  <w:num w:numId="9" w16cid:durableId="579219924">
+  <w:num w:numId="9" w16cid:durableId="1669136702">
     <w:abstractNumId w:val="0"/>
   </w:num>
 </w:numbering>

</xml_diff>

<commit_message>
Update algorithm documentation with bucket expansion and outlier filtering logic
</commit_message>
<xml_diff>
--- a/Algorithm_Documentation.docx
+++ b/Algorithm_Documentation.docx
@@ -34,6 +34,33 @@
     <w:p>
       <w:r>
         <w:t>**Brand + Model + Generation + Year + Engine Size + Fuel Type + Gearbox**</w:t>
+      </w:r>
+    </w:p>
+    <w:p>
+      <w:r>
+        <w:t>To ensure statistical accuracy and avoid outlier poisoning, the algorithm applies the following before calculating the baseline:</w:t>
+      </w:r>
+    </w:p>
+    <w:p>
+      <w:r>
+        <w:rPr>
+          <w:b/>
+        </w:rPr>
+        <w:t xml:space="preserve">Outlier Filtering (IQR p10-p90): </w:t>
+      </w:r>
+      <w:r>
+        <w:t>Excludes the cheapest 10% and most expensive 10% of cars in any bucket before calculating market metrics, preventing single scam listings from manipulating the baseline.</w:t>
+      </w:r>
+    </w:p>
+    <w:p>
+      <w:r>
+        <w:rPr>
+          <w:b/>
+        </w:rPr>
+        <w:t xml:space="preserve">Dynamic Bucket Expansion (Sliding Window): </w:t>
+      </w:r>
+      <w:r>
+        <w:t>If a strict configuration bucket has fewer than 5 cars, it dynamically expands the sample size by dropping Engine, Fuel, and Gearbox filters. If the listing is still too rare, it applies a Sliding Window, grouping the car with other vehicles in its generation built within +/- 2 years of its production date.</w:t>
       </w:r>
     </w:p>
     <w:p>

</xml_diff>